<commit_message>
Deployed 599dc0d with MkDocs version: 1.6.1
</commit_message>
<xml_diff>
--- a/Eurorack/202-Passive-Signal-Multipliers/Files/202-Rev.1.docx
+++ b/Eurorack/202-Passive-Signal-Multipliers/Files/202-Rev.1.docx
@@ -336,6 +336,7 @@
     <w:p>
       <w:pPr>
         <w:spacing w:line="360" w:lineRule="auto"/>
+        <w:jc w:val="center"/>
         <w:rPr>
           <w:rFonts w:ascii="Times New Roman" w:hAnsi="Times New Roman" w:cs="Times New Roman"/>
           <w:b/>
@@ -344,10 +345,80 @@
           <w:lang w:val="en-US"/>
         </w:rPr>
       </w:pPr>
+      <w:r>
+        <w:rPr>
+          <w:rFonts w:ascii="Times New Roman" w:hAnsi="Times New Roman" w:cs="Times New Roman"/>
+          <w:noProof/>
+          <w:lang w:val="en-US"/>
+        </w:rPr>
+        <w:drawing>
+          <wp:inline distT="0" distB="0" distL="0" distR="0" wp14:anchorId="53F4C14F" wp14:editId="29205935">
+            <wp:extent cx="2958063" cy="1634837"/>
+            <wp:effectExtent l="0" t="0" r="1270" b="3810"/>
+            <wp:docPr id="1007593804" name="Picture 1"/>
+            <wp:cNvGraphicFramePr>
+              <a:graphicFrameLocks xmlns:a="http://schemas.openxmlformats.org/drawingml/2006/main" noChangeAspect="1"/>
+            </wp:cNvGraphicFramePr>
+            <a:graphic xmlns:a="http://schemas.openxmlformats.org/drawingml/2006/main">
+              <a:graphicData uri="http://schemas.openxmlformats.org/drawingml/2006/picture">
+                <pic:pic xmlns:pic="http://schemas.openxmlformats.org/drawingml/2006/picture">
+                  <pic:nvPicPr>
+                    <pic:cNvPr id="1007593804" name="Picture 1007593804"/>
+                    <pic:cNvPicPr/>
+                  </pic:nvPicPr>
+                  <pic:blipFill>
+                    <a:blip r:embed="rId7" cstate="print">
+                      <a:extLst>
+                        <a:ext uri="{28A0092B-C50C-407E-A947-70E740481C1C}">
+                          <a14:useLocalDpi xmlns:a14="http://schemas.microsoft.com/office/drawing/2010/main" val="0"/>
+                        </a:ext>
+                      </a:extLst>
+                    </a:blip>
+                    <a:stretch>
+                      <a:fillRect/>
+                    </a:stretch>
+                  </pic:blipFill>
+                  <pic:spPr>
+                    <a:xfrm>
+                      <a:off x="0" y="0"/>
+                      <a:ext cx="3062751" cy="1692695"/>
+                    </a:xfrm>
+                    <a:prstGeom prst="rect">
+                      <a:avLst/>
+                    </a:prstGeom>
+                  </pic:spPr>
+                </pic:pic>
+              </a:graphicData>
+            </a:graphic>
+          </wp:inline>
+        </w:drawing>
+      </w:r>
     </w:p>
     <w:p>
       <w:pPr>
         <w:spacing w:line="360" w:lineRule="auto"/>
+        <w:jc w:val="center"/>
+        <w:rPr>
+          <w:rFonts w:ascii="Times New Roman" w:hAnsi="Times New Roman" w:cs="Times New Roman"/>
+          <w:i/>
+          <w:iCs/>
+          <w:lang w:val="en-US"/>
+        </w:rPr>
+      </w:pPr>
+      <w:r>
+        <w:rPr>
+          <w:rFonts w:ascii="Times New Roman" w:hAnsi="Times New Roman" w:cs="Times New Roman"/>
+          <w:i/>
+          <w:iCs/>
+          <w:lang w:val="en-US"/>
+        </w:rPr>
+        <w:t>fig. 3.1 Panel Overview</w:t>
+      </w:r>
+    </w:p>
+    <w:p>
+      <w:pPr>
+        <w:spacing w:line="360" w:lineRule="auto"/>
+        <w:jc w:val="center"/>
         <w:rPr>
           <w:rFonts w:ascii="Times New Roman" w:hAnsi="Times New Roman" w:cs="Times New Roman"/>
           <w:b/>
@@ -362,76 +433,79 @@
         <w:spacing w:line="360" w:lineRule="auto"/>
         <w:rPr>
           <w:rFonts w:ascii="Times New Roman" w:hAnsi="Times New Roman" w:cs="Times New Roman"/>
-          <w:lang w:val="en-US"/>
-        </w:rPr>
-      </w:pPr>
-    </w:p>
-    <w:p>
-      <w:pPr>
-        <w:spacing w:line="360" w:lineRule="auto"/>
-        <w:rPr>
-          <w:rFonts w:ascii="Times New Roman" w:hAnsi="Times New Roman" w:cs="Times New Roman"/>
-          <w:lang w:val="en-US"/>
-        </w:rPr>
-      </w:pPr>
-    </w:p>
-    <w:p>
-      <w:pPr>
-        <w:spacing w:line="360" w:lineRule="auto"/>
-        <w:rPr>
-          <w:rFonts w:ascii="Times New Roman" w:hAnsi="Times New Roman" w:cs="Times New Roman"/>
-          <w:lang w:val="en-US"/>
-        </w:rPr>
-      </w:pPr>
-    </w:p>
-    <w:p>
-      <w:pPr>
-        <w:spacing w:line="360" w:lineRule="auto"/>
-        <w:rPr>
-          <w:rFonts w:ascii="Times New Roman" w:hAnsi="Times New Roman" w:cs="Times New Roman"/>
-          <w:lang w:val="en-US"/>
-        </w:rPr>
-      </w:pPr>
-    </w:p>
-    <w:p>
-      <w:pPr>
-        <w:spacing w:line="360" w:lineRule="auto"/>
-        <w:rPr>
-          <w:rFonts w:ascii="Times New Roman" w:hAnsi="Times New Roman" w:cs="Times New Roman"/>
-          <w:lang w:val="en-US"/>
-        </w:rPr>
-      </w:pPr>
-    </w:p>
-    <w:p>
-      <w:pPr>
-        <w:spacing w:line="360" w:lineRule="auto"/>
-        <w:rPr>
-          <w:rFonts w:ascii="Times New Roman" w:hAnsi="Times New Roman" w:cs="Times New Roman"/>
-          <w:lang w:val="en-US"/>
-        </w:rPr>
-      </w:pPr>
-    </w:p>
-    <w:p>
-      <w:pPr>
-        <w:spacing w:line="360" w:lineRule="auto"/>
-        <w:rPr>
-          <w:rFonts w:ascii="Times New Roman" w:hAnsi="Times New Roman" w:cs="Times New Roman"/>
-          <w:lang w:val="en-US"/>
-        </w:rPr>
-      </w:pPr>
-    </w:p>
-    <w:p>
-      <w:pPr>
-        <w:spacing w:line="360" w:lineRule="auto"/>
-        <w:rPr>
-          <w:rFonts w:ascii="Times New Roman" w:hAnsi="Times New Roman" w:cs="Times New Roman"/>
           <w:b/>
           <w:bCs/>
           <w:u w:val="single"/>
           <w:lang w:val="en-US"/>
         </w:rPr>
       </w:pPr>
-      <w:r>
+    </w:p>
+    <w:p>
+      <w:pPr>
+        <w:spacing w:line="360" w:lineRule="auto"/>
+        <w:rPr>
+          <w:rFonts w:ascii="Times New Roman" w:hAnsi="Times New Roman" w:cs="Times New Roman"/>
+          <w:lang w:val="en-US"/>
+        </w:rPr>
+      </w:pPr>
+    </w:p>
+    <w:p>
+      <w:pPr>
+        <w:spacing w:line="360" w:lineRule="auto"/>
+        <w:rPr>
+          <w:rFonts w:ascii="Times New Roman" w:hAnsi="Times New Roman" w:cs="Times New Roman"/>
+          <w:lang w:val="en-US"/>
+        </w:rPr>
+      </w:pPr>
+    </w:p>
+    <w:p>
+      <w:pPr>
+        <w:spacing w:line="360" w:lineRule="auto"/>
+        <w:rPr>
+          <w:rFonts w:ascii="Times New Roman" w:hAnsi="Times New Roman" w:cs="Times New Roman"/>
+          <w:lang w:val="en-US"/>
+        </w:rPr>
+      </w:pPr>
+    </w:p>
+    <w:p>
+      <w:pPr>
+        <w:spacing w:line="360" w:lineRule="auto"/>
+        <w:rPr>
+          <w:rFonts w:ascii="Times New Roman" w:hAnsi="Times New Roman" w:cs="Times New Roman"/>
+          <w:lang w:val="en-US"/>
+        </w:rPr>
+      </w:pPr>
+    </w:p>
+    <w:p>
+      <w:pPr>
+        <w:spacing w:line="360" w:lineRule="auto"/>
+        <w:rPr>
+          <w:rFonts w:ascii="Times New Roman" w:hAnsi="Times New Roman" w:cs="Times New Roman"/>
+          <w:lang w:val="en-US"/>
+        </w:rPr>
+      </w:pPr>
+    </w:p>
+    <w:p>
+      <w:pPr>
+        <w:spacing w:line="360" w:lineRule="auto"/>
+        <w:rPr>
+          <w:rFonts w:ascii="Times New Roman" w:hAnsi="Times New Roman" w:cs="Times New Roman"/>
+          <w:lang w:val="en-US"/>
+        </w:rPr>
+      </w:pPr>
+    </w:p>
+    <w:p>
+      <w:pPr>
+        <w:spacing w:line="360" w:lineRule="auto"/>
+        <w:rPr>
+          <w:rFonts w:ascii="Times New Roman" w:hAnsi="Times New Roman" w:cs="Times New Roman"/>
+          <w:lang w:val="en-US"/>
+        </w:rPr>
+      </w:pPr>
+    </w:p>
+    <w:p>
+      <w:pPr>
+        <w:spacing w:line="360" w:lineRule="auto"/>
         <w:rPr>
           <w:rFonts w:ascii="Times New Roman" w:hAnsi="Times New Roman" w:cs="Times New Roman"/>
           <w:b/>
@@ -439,7 +513,15 @@
           <w:u w:val="single"/>
           <w:lang w:val="en-US"/>
         </w:rPr>
-        <w:lastRenderedPageBreak/>
+      </w:pPr>
+      <w:r>
+        <w:rPr>
+          <w:rFonts w:ascii="Times New Roman" w:hAnsi="Times New Roman" w:cs="Times New Roman"/>
+          <w:b/>
+          <w:bCs/>
+          <w:u w:val="single"/>
+          <w:lang w:val="en-US"/>
+        </w:rPr>
         <w:t>4</w:t>
       </w:r>
       <w:r>
@@ -979,8 +1061,8 @@
       </w:pPr>
     </w:p>
     <w:sectPr>
-      <w:footerReference w:type="even" r:id="rId7"/>
-      <w:footerReference w:type="default" r:id="rId8"/>
+      <w:footerReference w:type="even" r:id="rId8"/>
+      <w:footerReference w:type="default" r:id="rId9"/>
       <w:pgSz w:w="12240" w:h="15840"/>
       <w:pgMar w:top="1440" w:right="1440" w:bottom="1440" w:left="1440" w:header="708" w:footer="708" w:gutter="0"/>
       <w:cols w:space="708"/>

</xml_diff>